<commit_message>
feat: add pdf file
</commit_message>
<xml_diff>
--- a/essay1.docx
+++ b/essay1.docx
@@ -11,18 +11,12 @@
           <w:numId w:val="0"/>
         </w:numPr>
         <w:suppressAutoHyphens w:val="true"/>
-        <w:overflowPunct w:val="false"/>
+        <w:overflowPunct w:val="true"/>
         <w:bidi w:val="0"/>
-        <w:spacing w:lineRule="auto" w:line="360" w:before="0" w:after="227"/>
+        <w:spacing w:lineRule="auto" w:line="360" w:before="0" w:after="0"/>
         <w:ind w:firstLine="850" w:start="0" w:end="0"/>
         <w:jc w:val="both"/>
-        <w:rPr>
-          <w:rFonts w:ascii="Times New Roman" w:hAnsi="Times New Roman" w:eastAsia="Liberation Mono" w:cs="Liberation Mono"/>
-          <w:b/>
-          <w:bCs/>
-          <w:sz w:val="32"/>
-          <w:szCs w:val="32"/>
-        </w:rPr>
+        <w:rPr/>
       </w:pPr>
       <w:r>
         <w:rPr>
@@ -32,7 +26,7 @@
           <w:sz w:val="32"/>
           <w:szCs w:val="32"/>
         </w:rPr>
-        <w:t>Складна система — це не просто купа деталей, складених докупи. Вона має нову якість, яка з’являється саме через те, як ці деталі взаємодіють між собою.</w:t>
+        <w:t>Складна система - це не просто купа деталей, складених докупи. Вона має нову якість, яка з’являється саме через те, як ці деталі взаємодіють між собою.</w:t>
       </w:r>
     </w:p>
     <w:p>
@@ -44,16 +38,12 @@
           <w:numId w:val="0"/>
         </w:numPr>
         <w:suppressAutoHyphens w:val="true"/>
-        <w:overflowPunct w:val="false"/>
+        <w:overflowPunct w:val="true"/>
         <w:bidi w:val="0"/>
-        <w:spacing w:lineRule="auto" w:line="360" w:before="0" w:after="227"/>
+        <w:spacing w:lineRule="auto" w:line="360" w:before="0" w:after="0"/>
         <w:ind w:firstLine="850" w:start="0" w:end="0"/>
         <w:jc w:val="both"/>
-        <w:rPr>
-          <w:rFonts w:ascii="Times New Roman" w:hAnsi="Times New Roman" w:eastAsia="Liberation Mono" w:cs="Liberation Mono"/>
-          <w:sz w:val="28"/>
-          <w:szCs w:val="28"/>
-        </w:rPr>
+        <w:rPr/>
       </w:pPr>
       <w:r>
         <w:rPr>
@@ -61,7 +51,23 @@
           <w:sz w:val="28"/>
           <w:szCs w:val="28"/>
         </w:rPr>
-        <w:t>Емерджентність — це якраз про те, що ціле завжди більше, ніж просто сума частин. Коли починаєш копатися у складних системах, швидко розумієш: навіть якщо ти знаєш кожен елемент до дрібниць, все одно не поясниш, як працює вся система загалом. Можна вивчити кожну гвинтик, але коли все збирається разом — поведінка часто дивує. Ось це і є емерджентність: виникнення нових властивостей, які з’являються лише тоді, коли всі елементи починають працювати разом.</w:t>
+        <w:t>Емерджентність - це якраз про те, що ціле завжди більше, ніж просто сума частин. Коли починаєш копатися у складних системах, швидко розумієш: навіть якщо ти знаєш кожен елемент до дрібниць, все одно не поясниш, як працює вся система загалом. Можна вивчити кож</w:t>
+      </w:r>
+      <w:r>
+        <w:rPr>
+          <w:rFonts w:eastAsia="Liberation Mono" w:cs="Liberation Mono" w:ascii="Times New Roman" w:hAnsi="Times New Roman"/>
+          <w:sz w:val="28"/>
+          <w:szCs w:val="28"/>
+        </w:rPr>
+        <w:t>ен</w:t>
+      </w:r>
+      <w:r>
+        <w:rPr>
+          <w:rFonts w:eastAsia="Liberation Mono" w:cs="Liberation Mono" w:ascii="Times New Roman" w:hAnsi="Times New Roman"/>
+          <w:sz w:val="28"/>
+          <w:szCs w:val="28"/>
+        </w:rPr>
+        <w:t xml:space="preserve"> гвинтик, але коли все збирається разом - поведінка часто дивує. Ось це і є емерджентність: виникнення нових властивостей, які з’являються лише тоді, коли всі елементи починають працювати разом.</w:t>
       </w:r>
     </w:p>
     <w:p>
@@ -74,14 +80,10 @@
         </w:numPr>
         <w:suppressAutoHyphens w:val="true"/>
         <w:bidi w:val="0"/>
-        <w:spacing w:lineRule="auto" w:line="360" w:before="0" w:after="227"/>
+        <w:spacing w:lineRule="auto" w:line="360" w:before="0" w:after="0"/>
         <w:ind w:firstLine="850" w:start="0" w:end="0"/>
         <w:jc w:val="both"/>
-        <w:rPr>
-          <w:rFonts w:ascii="Times New Roman" w:hAnsi="Times New Roman" w:eastAsia="Liberation Mono" w:cs="Liberation Mono"/>
-          <w:sz w:val="28"/>
-          <w:szCs w:val="28"/>
-        </w:rPr>
+        <w:rPr/>
       </w:pPr>
       <w:r>
         <w:rPr>
@@ -102,14 +104,10 @@
         </w:numPr>
         <w:suppressAutoHyphens w:val="true"/>
         <w:bidi w:val="0"/>
-        <w:spacing w:lineRule="auto" w:line="360" w:before="0" w:after="227"/>
+        <w:spacing w:lineRule="auto" w:line="360" w:before="0" w:after="0"/>
         <w:ind w:firstLine="850" w:start="0" w:end="0"/>
         <w:jc w:val="both"/>
-        <w:rPr>
-          <w:rFonts w:ascii="Times New Roman" w:hAnsi="Times New Roman" w:eastAsia="Liberation Mono" w:cs="Liberation Mono"/>
-          <w:sz w:val="28"/>
-          <w:szCs w:val="28"/>
-        </w:rPr>
+        <w:rPr/>
       </w:pPr>
       <w:r>
         <w:rPr>
@@ -117,7 +115,7 @@
           <w:sz w:val="28"/>
           <w:szCs w:val="28"/>
         </w:rPr>
-        <w:t>Подивіться на будь-яку соціальну чи технічну систему — і все стає зрозуміло. Колектив — це не просто набір людей, у нього з’являється власний «характер» і можливості. Складний гаджет виконує те, на що жодна окрема мікросхема не здатна. Важливо не забувати: система ніколи не існує сама по собі. Вона завжди частина чогось більшого, постійно взаємодіє із середовищем. Емерджентність якраз і вчить: щоб зрозуміти систему, треба дивитися не на окремі деталі, а на те, яку нову якість вони створюють разом.</w:t>
+        <w:t>Подивіться на будь-яку соціальну чи технічну систему - і все стає зрозуміло. Колектив - це не просто набір людей, у нього з’являється власний характер і можливості. Складний гаджет виконує те, на що жодна окрема мікросхема не здатна. Важливо не забувати: система ніколи не існує сама по собі. Вона завжди частина чогось більшого, постійно взаємодіє із середовищем. Емерджентність якраз і вчить: щоб зрозуміти систему, треба дивитися не на окремі деталі, а на те, яку нову якість вони створюють разом.</w:t>
       </w:r>
     </w:p>
     <w:p>
@@ -130,14 +128,10 @@
         </w:numPr>
         <w:suppressAutoHyphens w:val="true"/>
         <w:bidi w:val="0"/>
-        <w:spacing w:lineRule="auto" w:line="360" w:before="0" w:after="227"/>
+        <w:spacing w:lineRule="auto" w:line="360" w:before="0" w:after="0"/>
         <w:ind w:firstLine="850" w:start="0" w:end="0"/>
         <w:jc w:val="both"/>
-        <w:rPr>
-          <w:rFonts w:ascii="Times New Roman" w:hAnsi="Times New Roman" w:eastAsia="Liberation Mono" w:cs="Liberation Mono"/>
-          <w:sz w:val="28"/>
-          <w:szCs w:val="28"/>
-        </w:rPr>
+        <w:rPr/>
       </w:pPr>
       <w:r>
         <w:rPr>
@@ -145,7 +139,7 @@
           <w:sz w:val="28"/>
           <w:szCs w:val="28"/>
         </w:rPr>
-        <w:t>Такий підхід повністю змінює наш погляд на вирішення проблем. Замість того, щоб просто «латати» окремі частини, ми починаємо звертати увагу на архітектуру зв’язків, що тримає систему цілісною. Розуміння емерджентності нагадує: жодна структура не працює сама по собі, вона підпорядкована спільній меті, яка і визначає поведінку всього цілого. Тож справжня майстерність — не лише знати кожну деталь, а вміти так налаштувати їхню взаємодію, щоб розрізнені елементи стали єдиною ефективною системою.</w:t>
+        <w:t>Такий підхід повністю змінює наш погляд на вирішення проблем. Замість того, щоб просто латати окремі частини, ми починаємо звертати увагу на архітектуру зв’язків, що тримає систему цілісною. Розуміння емерджентності нагадує: жодна структура не працює сама по собі, вона підпорядкована спільній меті, яка і визначає поведінку всього цілого. Тож справжня майстерність - не лише знати кожну деталь, а вміти так налаштувати їхню взаємодію, щоб розрізнені елементи стали єдиною ефективною системою.</w:t>
       </w:r>
     </w:p>
     <w:sectPr>
@@ -442,7 +436,7 @@
     <w:pPr>
       <w:widowControl w:val="false"/>
       <w:suppressAutoHyphens w:val="true"/>
-      <w:overflowPunct w:val="false"/>
+      <w:overflowPunct w:val="true"/>
       <w:bidi w:val="0"/>
       <w:spacing w:before="0" w:after="0"/>
       <w:jc w:val="start"/>

</xml_diff>